<commit_message>
ADDING TODAY'S WORK - 17.07.2026
</commit_message>
<xml_diff>
--- a/write_up/drafts/3_materials_and_methods/methods_DRAFT_2.docx
+++ b/write_up/drafts/3_materials_and_methods/methods_DRAFT_2.docx
@@ -72,7 +72,18 @@
     </w:p>
     <w:p>
       <w:r>
-        <w:t>[figure legend should state that the automated pathway enrichment analysis techniques tested during method development were unsuitable for use on Calu-3 HBECs]</w:t>
+        <w:t xml:space="preserve">[figure legend should state that the automated pathway enrichment analysis techniques tested during method development were unsuitable for use on Calu-3 </w:t>
+      </w:r>
+      <w:r>
+        <w:t>cells</w:t>
+      </w:r>
+      <w:r>
+        <w:t>]</w:t>
+      </w:r>
+    </w:p>
+    <w:p>
+      <w:r>
+        <w:t>[change calu-3 hbecs to calu-3 cells in figure]</w:t>
       </w:r>
     </w:p>
     <w:p>
@@ -119,29 +130,19 @@
     </w:p>
     <w:p>
       <w:r>
-        <w:t>This study uses raw next-generation sequencing (NGS) data acquired from small RNA-</w:t>
-      </w:r>
-      <w:proofErr w:type="spellStart"/>
-      <w:r>
-        <w:t>Seq</w:t>
-      </w:r>
-      <w:proofErr w:type="spellEnd"/>
-      <w:r>
-        <w:t xml:space="preserve"> </w:t>
-      </w:r>
-      <w:r>
-        <w:t xml:space="preserve">using the </w:t>
-      </w:r>
-      <w:proofErr w:type="spellStart"/>
-      <w:r>
-        <w:t>miND</w:t>
-      </w:r>
-      <w:proofErr w:type="spellEnd"/>
-      <w:r>
-        <w:t>® analysis pipeline [mind reference]</w:t>
-      </w:r>
-      <w:r>
-        <w:t xml:space="preserve">. RNA was acquired from HBEC-derived EVs following </w:t>
+        <w:t xml:space="preserve">This study uses raw next-generation sequencing (NGS) data acquired from small RNA-Seq </w:t>
+      </w:r>
+      <w:r>
+        <w:t>using the miND® analysis pipeline [mind reference]</w:t>
+      </w:r>
+      <w:r>
+        <w:t xml:space="preserve">. RNA was acquired from </w:t>
+      </w:r>
+      <w:r>
+        <w:t>airway epithelium-derived</w:t>
+      </w:r>
+      <w:r>
+        <w:t xml:space="preserve"> EVs following </w:t>
       </w:r>
       <w:r>
         <w:t>cellular</w:t>
@@ -200,7 +201,13 @@
         <w:t>C</w:t>
       </w:r>
       <w:r>
-        <w:t>alu-3 HBECs to</w:t>
+        <w:t>alu-3</w:t>
+      </w:r>
+      <w:r>
+        <w:t xml:space="preserve"> epithelial cells</w:t>
+      </w:r>
+      <w:r>
+        <w:t xml:space="preserve"> to</w:t>
       </w:r>
       <w:r>
         <w:t xml:space="preserve"> nebulised</w:t>
@@ -246,15 +253,7 @@
     </w:p>
     <w:p>
       <w:r>
-        <w:t xml:space="preserve">Raw sequencing reads were trimmed using </w:t>
-      </w:r>
-      <w:proofErr w:type="spellStart"/>
-      <w:r>
-        <w:t>Cutadapt</w:t>
-      </w:r>
-      <w:proofErr w:type="spellEnd"/>
-      <w:r>
-        <w:t xml:space="preserve"> [version], targeting the </w:t>
+        <w:t xml:space="preserve">Raw sequencing reads were trimmed using Cutadapt [version], targeting the </w:t>
       </w:r>
       <w:r>
         <w:t>Realseq3P</w:t>
@@ -266,15 +265,7 @@
         <w:t>TGGAATTCTC</w:t>
       </w:r>
       <w:r>
-        <w:t xml:space="preserve">). Only reads measuring 18-30bp and quality &gt;30 (Phred) </w:t>
-      </w:r>
-      <w:proofErr w:type="gramStart"/>
-      <w:r>
-        <w:t>were</w:t>
-      </w:r>
-      <w:proofErr w:type="gramEnd"/>
-      <w:r>
-        <w:t xml:space="preserve"> retained; </w:t>
+        <w:t xml:space="preserve">). Only reads measuring 18-30bp and quality &gt;30 (Phred) were retained; </w:t>
       </w:r>
       <w:r>
         <w:t xml:space="preserve">the first base of each read was unconditionally removed and reads without an </w:t>
@@ -290,26 +281,13 @@
         <w:t xml:space="preserve">Quality control was performed </w:t>
       </w:r>
       <w:r>
-        <w:t xml:space="preserve">using </w:t>
-      </w:r>
-      <w:proofErr w:type="spellStart"/>
-      <w:r>
-        <w:t>FastQC</w:t>
-      </w:r>
-      <w:proofErr w:type="spellEnd"/>
-      <w:r>
-        <w:t xml:space="preserve"> [version]</w:t>
+        <w:t>using FastQC [version]</w:t>
       </w:r>
       <w:r>
         <w:t xml:space="preserve"> and </w:t>
       </w:r>
-      <w:proofErr w:type="spellStart"/>
-      <w:r>
-        <w:t>miRTrace</w:t>
-      </w:r>
-      <w:proofErr w:type="spellEnd"/>
-      <w:r>
-        <w:t xml:space="preserve"> </w:t>
+      <w:r>
+        <w:t xml:space="preserve">miRTrace </w:t>
       </w:r>
       <w:r>
         <w:t>[version] and</w:t>
@@ -320,13 +298,8 @@
       <w:r>
         <w:t xml:space="preserve"> with </w:t>
       </w:r>
-      <w:proofErr w:type="spellStart"/>
-      <w:r>
-        <w:t>MultiQC</w:t>
-      </w:r>
-      <w:proofErr w:type="spellEnd"/>
-      <w:r>
-        <w:t xml:space="preserve"> [version].</w:t>
+      <w:r>
+        <w:t>MultiQC [version].</w:t>
       </w:r>
     </w:p>
     <w:p/>
@@ -358,15 +331,7 @@
         <w:t>mapper.pl</w:t>
       </w:r>
       <w:r>
-        <w:t xml:space="preserve"> script then mapped to mature and hairpin [version] references (</w:t>
-      </w:r>
-      <w:proofErr w:type="spellStart"/>
-      <w:r>
-        <w:t>miRBase</w:t>
-      </w:r>
-      <w:proofErr w:type="spellEnd"/>
-      <w:r>
-        <w:t xml:space="preserve"> [version]) and quantified using </w:t>
+        <w:t xml:space="preserve"> script then mapped to mature and hairpin [version] references (miRBase [version]) and quantified using </w:t>
       </w:r>
       <w:r>
         <w:rPr>
@@ -398,15 +363,7 @@
     </w:p>
     <w:p>
       <w:r>
-        <w:t xml:space="preserve">DE analysis was performed using </w:t>
-      </w:r>
-      <w:proofErr w:type="spellStart"/>
-      <w:r>
-        <w:t>edgeR</w:t>
-      </w:r>
-      <w:proofErr w:type="spellEnd"/>
-      <w:r>
-        <w:t xml:space="preserve"> [version] [in R studio?]. Lowly expressed miRNAs were excluded using the default filtering provided by the package. Normalisation was performed using the </w:t>
+        <w:t xml:space="preserve">DE analysis was performed using edgeR [version] [in R studio?]. Lowly expressed miRNAs were excluded using the default filtering provided by the package. Normalisation was performed using the </w:t>
       </w:r>
       <w:r>
         <w:t>trimmed mean of M-values</w:t>
@@ -462,15 +419,7 @@
     </w:p>
     <w:p>
       <w:r>
-        <w:t xml:space="preserve">[I have confirmed the contrasts as treated vs untreated – positive </w:t>
-      </w:r>
-      <w:proofErr w:type="spellStart"/>
-      <w:r>
-        <w:t>logfc</w:t>
-      </w:r>
-      <w:proofErr w:type="spellEnd"/>
-      <w:r>
-        <w:t xml:space="preserve"> means upregulated in treated]</w:t>
+        <w:t>[I have confirmed the contrasts as treated vs untreated – positive logfc means upregulated in treated]</w:t>
       </w:r>
     </w:p>
     <w:p/>
@@ -589,11 +538,9 @@
       <w:r>
         <w:t xml:space="preserve"> of significantly DE miRNAs were identified using </w:t>
       </w:r>
-      <w:proofErr w:type="spellStart"/>
       <w:r>
         <w:t>multiMiR</w:t>
       </w:r>
-      <w:proofErr w:type="spellEnd"/>
       <w:r>
         <w:t xml:space="preserve"> [version] R</w:t>
       </w:r>
@@ -601,15 +548,7 @@
         <w:t xml:space="preserve"> </w:t>
       </w:r>
       <w:r>
-        <w:t xml:space="preserve">package by querying </w:t>
-      </w:r>
-      <w:proofErr w:type="spellStart"/>
-      <w:r>
-        <w:t>miRTarBase</w:t>
-      </w:r>
-      <w:proofErr w:type="spellEnd"/>
-      <w:r>
-        <w:t xml:space="preserve"> [version]</w:t>
+        <w:t>package by querying miRTarBase [version]</w:t>
       </w:r>
       <w:r>
         <w:t xml:space="preserve">. Pathway enrichment </w:t>
@@ -631,66 +570,43 @@
         <w:t>using</w:t>
       </w:r>
       <w:r>
+        <w:t xml:space="preserve"> the enrichPathway()</w:t>
+      </w:r>
+      <w:r>
+        <w:t xml:space="preserve"> </w:t>
+      </w:r>
+      <w:r>
+        <w:t>function from</w:t>
+      </w:r>
+      <w:r>
         <w:t xml:space="preserve"> the </w:t>
       </w:r>
-      <w:proofErr w:type="spellStart"/>
-      <w:proofErr w:type="gramStart"/>
-      <w:r>
-        <w:t>enrichPathway</w:t>
-      </w:r>
-      <w:proofErr w:type="spellEnd"/>
-      <w:r>
-        <w:t>(</w:t>
-      </w:r>
-      <w:proofErr w:type="gramEnd"/>
-      <w:r>
-        <w:t>)</w:t>
+      <w:r>
+        <w:t>ReactomePA [version] R package</w:t>
+      </w:r>
+      <w:r>
+        <w:t>,</w:t>
       </w:r>
       <w:r>
         <w:t xml:space="preserve"> </w:t>
       </w:r>
       <w:r>
-        <w:t>function from</w:t>
-      </w:r>
-      <w:r>
-        <w:t xml:space="preserve"> the </w:t>
-      </w:r>
-      <w:proofErr w:type="spellStart"/>
-      <w:r>
-        <w:t>ReactomePA</w:t>
-      </w:r>
-      <w:proofErr w:type="spellEnd"/>
-      <w:r>
-        <w:t xml:space="preserve"> [version] R package</w:t>
-      </w:r>
-      <w:r>
-        <w:t>,</w:t>
+        <w:t xml:space="preserve">which </w:t>
+      </w:r>
+      <w:r>
+        <w:t>implements</w:t>
       </w:r>
       <w:r>
         <w:t xml:space="preserve"> </w:t>
       </w:r>
       <w:r>
-        <w:t xml:space="preserve">which </w:t>
-      </w:r>
-      <w:r>
-        <w:t>implements</w:t>
-      </w:r>
-      <w:r>
-        <w:t xml:space="preserve"> </w:t>
-      </w:r>
-      <w:r>
         <w:t>a</w:t>
       </w:r>
       <w:r>
         <w:t xml:space="preserve"> hypergeometric over-representation test to identify </w:t>
       </w:r>
-      <w:proofErr w:type="spellStart"/>
-      <w:r>
-        <w:t>Reactome</w:t>
-      </w:r>
-      <w:proofErr w:type="spellEnd"/>
-      <w:r>
-        <w:t xml:space="preserve"> </w:t>
+      <w:r>
+        <w:t xml:space="preserve">Reactome </w:t>
       </w:r>
       <w:r>
         <w:t xml:space="preserve">pathways enriched among </w:t>
@@ -775,34 +691,13 @@
         <w:t>submitted</w:t>
       </w:r>
       <w:r>
-        <w:t xml:space="preserve"> to </w:t>
-      </w:r>
-      <w:proofErr w:type="spellStart"/>
-      <w:r>
-        <w:t>miEAA</w:t>
-      </w:r>
-      <w:proofErr w:type="spellEnd"/>
-      <w:r>
-        <w:t xml:space="preserve"> 2.0 [version] to identify </w:t>
+        <w:t xml:space="preserve"> to miEAA 2.0 [version] to identify </w:t>
       </w:r>
       <w:r>
         <w:t xml:space="preserve">enriched </w:t>
       </w:r>
-      <w:proofErr w:type="spellStart"/>
-      <w:r>
-        <w:t>Reactome</w:t>
-      </w:r>
-      <w:proofErr w:type="spellEnd"/>
-      <w:r>
-        <w:t xml:space="preserve"> (</w:t>
-      </w:r>
-      <w:proofErr w:type="spellStart"/>
-      <w:r>
-        <w:t>miRPathDB</w:t>
-      </w:r>
-      <w:proofErr w:type="spellEnd"/>
-      <w:r>
-        <w:t xml:space="preserve">) </w:t>
+      <w:r>
+        <w:t xml:space="preserve">Reactome (miRPathDB) </w:t>
       </w:r>
       <w:r>
         <w:t>pathways</w:t>
@@ -892,15 +787,7 @@
         <w:t xml:space="preserve"> </w:t>
       </w:r>
       <w:r>
-        <w:t>change (</w:t>
-      </w:r>
-      <w:proofErr w:type="spellStart"/>
-      <w:r>
-        <w:t>logFC</w:t>
-      </w:r>
-      <w:proofErr w:type="spellEnd"/>
-      <w:r>
-        <w:t xml:space="preserve">). </w:t>
+        <w:t xml:space="preserve">change (logFC). </w:t>
       </w:r>
       <w:r>
         <w:t xml:space="preserve">For </w:t>
@@ -1208,15 +1095,7 @@
     </w:p>
     <w:p>
       <w:r>
-        <w:t>[</w:t>
-      </w:r>
-      <w:proofErr w:type="spellStart"/>
-      <w:r>
-        <w:t>qiagen</w:t>
-      </w:r>
-      <w:proofErr w:type="spellEnd"/>
-      <w:r>
-        <w:t xml:space="preserve"> stats?]</w:t>
+        <w:t>[qiagen stats?]</w:t>
       </w:r>
     </w:p>
     <w:p>
@@ -1244,18 +1123,8 @@
       <w:r>
         <w:t xml:space="preserve">the </w:t>
       </w:r>
-      <w:proofErr w:type="spellStart"/>
-      <w:proofErr w:type="gramStart"/>
-      <w:r>
-        <w:t>prcomp</w:t>
-      </w:r>
-      <w:proofErr w:type="spellEnd"/>
-      <w:r>
-        <w:t>(</w:t>
-      </w:r>
-      <w:proofErr w:type="gramEnd"/>
-      <w:r>
-        <w:t>)</w:t>
+      <w:r>
+        <w:t>prcomp()</w:t>
       </w:r>
       <w:r>
         <w:t xml:space="preserve"> </w:t>
@@ -1321,21 +1190,25 @@
     </w:p>
     <w:p>
       <w:r>
-        <w:t>DE analysis was previously performed for all allergen exposures in primary and Calu-3 HBECs by T</w:t>
+        <w:t xml:space="preserve">DE analysis was previously performed for all allergen exposures in primary </w:t>
+      </w:r>
+      <w:r>
+        <w:t xml:space="preserve">HBECs </w:t>
+      </w:r>
+      <w:r>
+        <w:t xml:space="preserve">and Calu-3 </w:t>
+      </w:r>
+      <w:r>
+        <w:t>cells</w:t>
+      </w:r>
+      <w:r>
+        <w:t xml:space="preserve"> by T</w:t>
       </w:r>
       <w:r>
         <w:t>A</w:t>
       </w:r>
       <w:r>
-        <w:t xml:space="preserve">miRNA [link] using the </w:t>
-      </w:r>
-      <w:proofErr w:type="spellStart"/>
-      <w:r>
-        <w:t>miND</w:t>
-      </w:r>
-      <w:proofErr w:type="spellEnd"/>
-      <w:r>
-        <w:t xml:space="preserve">® pipeline [reference?]. Pathway analysis was performed using DE miRNAs </w:t>
+        <w:t xml:space="preserve">miRNA [link] using the miND® pipeline [reference?]. Pathway analysis was performed using DE miRNAs </w:t>
       </w:r>
       <w:r>
         <w:t>in</w:t>

</xml_diff>

<commit_message>
ADDING TODAY'S WORK - 20.07.2026
</commit_message>
<xml_diff>
--- a/write_up/drafts/3_materials_and_methods/methods_DRAFT_2.docx
+++ b/write_up/drafts/3_materials_and_methods/methods_DRAFT_2.docx
@@ -96,7 +96,13 @@
     </w:p>
     <w:p>
       <w:r>
-        <w:t>[rename ‘pathway analysis’ for calu3 cells to something more appropriate]</w:t>
+        <w:t>[rename ‘pathway analysis’ for calu3 cells to something more appropriate</w:t>
+      </w:r>
+      <w:r>
+        <w:t xml:space="preserve"> e.g., ‘biological function’ or ‘functional analysis’</w:t>
+      </w:r>
+      <w:r>
+        <w:t>]</w:t>
       </w:r>
     </w:p>
     <w:p>
@@ -285,7 +291,6 @@
         </w:numPr>
       </w:pPr>
       <w:r>
-        <w:lastRenderedPageBreak/>
         <w:t xml:space="preserve">Preprocessing </w:t>
       </w:r>
     </w:p>
@@ -594,7 +599,11 @@
         <w:t>nriched pathways</w:t>
       </w:r>
       <w:r>
-        <w:t xml:space="preserve"> were then compared to pathway</w:t>
+        <w:t xml:space="preserve"> </w:t>
+      </w:r>
+      <w:r>
+        <w:lastRenderedPageBreak/>
+        <w:t>were then compared to pathway</w:t>
       </w:r>
       <w:r>
         <w:t xml:space="preserve"> results </w:t>
@@ -1164,7 +1173,11 @@
         <w:t xml:space="preserve">) </w:t>
       </w:r>
       <w:r>
-        <w:t xml:space="preserve">and combined with </w:t>
+        <w:t xml:space="preserve">and </w:t>
+      </w:r>
+      <w:r>
+        <w:lastRenderedPageBreak/>
+        <w:t xml:space="preserve">combined with </w:t>
       </w:r>
       <w:r>
         <w:t xml:space="preserve">each of the following keywords using the </w:t>
@@ -1530,7 +1543,11 @@
         <w:t xml:space="preserve">A random subset of the </w:t>
       </w:r>
       <w:r>
-        <w:t xml:space="preserve">raw sequencing </w:t>
+        <w:t xml:space="preserve">raw </w:t>
+      </w:r>
+      <w:r>
+        <w:lastRenderedPageBreak/>
+        <w:t xml:space="preserve">sequencing </w:t>
       </w:r>
       <w:r>
         <w:t xml:space="preserve">data </w:t>
@@ -1592,7 +1609,6 @@
     </w:p>
     <w:p>
       <w:r>
-        <w:lastRenderedPageBreak/>
         <w:t>[might want to take the subset from a publicly available miRNA dataset so don’t have to worry about getting GH/WB’s permission]</w:t>
       </w:r>
     </w:p>

</xml_diff>

<commit_message>
ADDING TODAY'S WORK - 23.07.2026
</commit_message>
<xml_diff>
--- a/write_up/drafts/3_materials_and_methods/methods_DRAFT_2.docx
+++ b/write_up/drafts/3_materials_and_methods/methods_DRAFT_2.docx
@@ -286,7 +286,13 @@
         <w:t>ere</w:t>
       </w:r>
       <w:r>
-        <w:t xml:space="preserve"> executed in triplicate. </w:t>
+        <w:t xml:space="preserve"> executed in triplicate</w:t>
+      </w:r>
+      <w:r>
+        <w:t xml:space="preserve"> [from samples originating from 3 donors?]</w:t>
+      </w:r>
+      <w:r>
+        <w:t xml:space="preserve">. </w:t>
       </w:r>
       <w:r>
         <w:t xml:space="preserve">Sample details are found in Supp Table [x]. </w:t>

</xml_diff>